<commit_message>
cgc-letterhead: switch to client-corrected template, add layout rules and portable package
Co-Authored-By: Claude Sonnet 5.5 <noreply@anthropic.com>
Claude-Session: https://claude.ai/code/session_016HiExUKdWNDuhXuV6zumpE
</commit_message>
<xml_diff>
--- a/.claude/skills/cgc-letterhead/assets/CGC_letterhead_template.docx
+++ b/.claude/skills/cgc-letterhead/assets/CGC_letterhead_template.docx
@@ -4,16 +4,315 @@
   <w:body>
     <w:p>
       <w:pPr>
-        <w:spacing w:after="0" w:line="240" w:lineRule="auto"/>
         <w:contextualSpacing/>
+      </w:pPr>
+      <w:r>
+        <w:t>Исх. № ____ от «__» ________ 2026 г.</w:t>
+      </w:r>
+    </w:p>
+    <w:p>
+      <w:pPr>
+        <w:contextualSpacing/>
+      </w:pPr>
+    </w:p>
+    <w:p>
+      <w:pPr>
+        <w:ind w:left="5812"/>
+        <w:contextualSpacing/>
+        <w:jc w:val="center"/>
+      </w:pPr>
+    </w:p>
+    <w:p>
+      <w:pPr>
+        <w:ind w:left="5812"/>
+        <w:contextualSpacing/>
+        <w:jc w:val="center"/>
+      </w:pPr>
+    </w:p>
+    <w:p>
+      <w:pPr>
+        <w:ind w:left="5812"/>
+        <w:contextualSpacing/>
+        <w:jc w:val="center"/>
+      </w:pPr>
+      <w:r>
+        <w:t>Директору ТОО «Наименование»</w:t>
+      </w:r>
+    </w:p>
+    <w:p>
+      <w:pPr>
+        <w:ind w:left="5812"/>
+        <w:contextualSpacing/>
+        <w:jc w:val="center"/>
+      </w:pPr>
+      <w:r>
+        <w:t>Иванову И.И.</w:t>
+      </w:r>
+    </w:p>
+    <w:p>
+      <w:pPr>
+        <w:contextualSpacing/>
+        <w:jc w:val="center"/>
         <w:rPr>
-          <w:rFonts w:ascii="Times New Roman" w:eastAsia="Calibri" w:hAnsi="Times New Roman" w:cs="Times New Roman"/>
-          <w:i/>
-          <w:iCs/>
-          <w:sz w:val="20"/>
-          <w:szCs w:val="20"/>
+          <w:b/>
         </w:rPr>
       </w:pPr>
+    </w:p>
+    <w:p>
+      <w:pPr>
+        <w:contextualSpacing/>
+        <w:jc w:val="center"/>
+        <w:rPr>
+          <w:b/>
+        </w:rPr>
+      </w:pPr>
+    </w:p>
+    <w:p>
+      <w:pPr>
+        <w:contextualSpacing/>
+        <w:jc w:val="center"/>
+      </w:pPr>
+      <w:r>
+        <w:t>Уважаемый Иван Иванович!</w:t>
+      </w:r>
+    </w:p>
+    <w:p>
+      <w:pPr>
+        <w:ind w:firstLine="709"/>
+        <w:contextualSpacing/>
+        <w:jc w:val="both"/>
+      </w:pPr>
+      <w:r>
+        <w:t xml:space="preserve">Это образец документа на фирменном бланке ТОО «Caspian Geology Center». Шапка (логотип, адреса на трёх </w:t>
+      </w:r>
+      <w:r>
+        <w:t>языках, разделители) и водяной знак взяты из оригинального бланка без изменений; текст документа располагается ниже шапки.</w:t>
+      </w:r>
+    </w:p>
+    <w:p>
+      <w:pPr>
+        <w:ind w:firstLine="709"/>
+        <w:contextualSpacing/>
+        <w:jc w:val="both"/>
+      </w:pPr>
+    </w:p>
+    <w:p>
+      <w:pPr>
+        <w:ind w:firstLine="709"/>
+        <w:contextualSpacing/>
+        <w:jc w:val="both"/>
+      </w:pPr>
+      <w:r>
+        <w:t>Просим рассмотреть настоящее письмо и направить ответ в установленный срок.</w:t>
+      </w:r>
+    </w:p>
+    <w:tbl>
+      <w:tblPr>
+        <w:tblStyle w:val="a3"/>
+        <w:tblW w:w="8647" w:type="dxa"/>
+        <w:tblInd w:w="704" w:type="dxa"/>
+        <w:tblLook w:val="04A0" w:firstRow="1" w:lastRow="0" w:firstColumn="1" w:lastColumn="0" w:noHBand="0" w:noVBand="1"/>
+      </w:tblPr>
+      <w:tblGrid>
+        <w:gridCol w:w="567"/>
+        <w:gridCol w:w="5102"/>
+        <w:gridCol w:w="1134"/>
+        <w:gridCol w:w="1844"/>
+      </w:tblGrid>
+      <w:tr>
+        <w:tc>
+          <w:tcPr>
+            <w:tcW w:w="567" w:type="dxa"/>
+          </w:tcPr>
+          <w:p>
+            <w:pPr>
+              <w:contextualSpacing/>
+            </w:pPr>
+            <w:r>
+              <w:rPr>
+                <w:b/>
+              </w:rPr>
+              <w:t>№</w:t>
+            </w:r>
+          </w:p>
+        </w:tc>
+        <w:tc>
+          <w:tcPr>
+            <w:tcW w:w="5102" w:type="dxa"/>
+          </w:tcPr>
+          <w:p>
+            <w:pPr>
+              <w:contextualSpacing/>
+            </w:pPr>
+            <w:r>
+              <w:rPr>
+                <w:b/>
+              </w:rPr>
+              <w:t>Наименование</w:t>
+            </w:r>
+          </w:p>
+        </w:tc>
+        <w:tc>
+          <w:tcPr>
+            <w:tcW w:w="1134" w:type="dxa"/>
+          </w:tcPr>
+          <w:p>
+            <w:pPr>
+              <w:contextualSpacing/>
+            </w:pPr>
+            <w:r>
+              <w:rPr>
+                <w:b/>
+              </w:rPr>
+              <w:t>Ед.</w:t>
+            </w:r>
+          </w:p>
+        </w:tc>
+        <w:tc>
+          <w:tcPr>
+            <w:tcW w:w="1844" w:type="dxa"/>
+          </w:tcPr>
+          <w:p>
+            <w:pPr>
+              <w:contextualSpacing/>
+            </w:pPr>
+            <w:r>
+              <w:rPr>
+                <w:b/>
+              </w:rPr>
+              <w:t>Кол-во</w:t>
+            </w:r>
+          </w:p>
+        </w:tc>
+      </w:tr>
+      <w:tr>
+        <w:tc>
+          <w:tcPr>
+            <w:tcW w:w="567" w:type="dxa"/>
+          </w:tcPr>
+          <w:p>
+            <w:pPr>
+              <w:contextualSpacing/>
+            </w:pPr>
+            <w:r>
+              <w:t>1</w:t>
+            </w:r>
+          </w:p>
+        </w:tc>
+        <w:tc>
+          <w:tcPr>
+            <w:tcW w:w="5102" w:type="dxa"/>
+          </w:tcPr>
+          <w:p>
+            <w:pPr>
+              <w:contextualSpacing/>
+            </w:pPr>
+            <w:r>
+              <w:t>Батиметрическая съёмка</w:t>
+            </w:r>
+          </w:p>
+        </w:tc>
+        <w:tc>
+          <w:tcPr>
+            <w:tcW w:w="1134" w:type="dxa"/>
+          </w:tcPr>
+          <w:p>
+            <w:pPr>
+              <w:contextualSpacing/>
+            </w:pPr>
+            <w:r>
+              <w:t>км²</w:t>
+            </w:r>
+          </w:p>
+        </w:tc>
+        <w:tc>
+          <w:tcPr>
+            <w:tcW w:w="1844" w:type="dxa"/>
+          </w:tcPr>
+          <w:p>
+            <w:pPr>
+              <w:contextualSpacing/>
+            </w:pPr>
+            <w:r>
+              <w:t>12,5</w:t>
+            </w:r>
+          </w:p>
+        </w:tc>
+      </w:tr>
+      <w:tr>
+        <w:tc>
+          <w:tcPr>
+            <w:tcW w:w="567" w:type="dxa"/>
+          </w:tcPr>
+          <w:p>
+            <w:pPr>
+              <w:contextualSpacing/>
+            </w:pPr>
+            <w:r>
+              <w:t>2</w:t>
+            </w:r>
+          </w:p>
+        </w:tc>
+        <w:tc>
+          <w:tcPr>
+            <w:tcW w:w="5102" w:type="dxa"/>
+          </w:tcPr>
+          <w:p>
+            <w:pPr>
+              <w:contextualSpacing/>
+            </w:pPr>
+            <w:r>
+              <w:t>Отчёт</w:t>
+            </w:r>
+          </w:p>
+        </w:tc>
+        <w:tc>
+          <w:tcPr>
+            <w:tcW w:w="1134" w:type="dxa"/>
+          </w:tcPr>
+          <w:p>
+            <w:pPr>
+              <w:contextualSpacing/>
+            </w:pPr>
+            <w:r>
+              <w:t>шт.</w:t>
+            </w:r>
+          </w:p>
+        </w:tc>
+        <w:tc>
+          <w:tcPr>
+            <w:tcW w:w="1844" w:type="dxa"/>
+          </w:tcPr>
+          <w:p>
+            <w:pPr>
+              <w:contextualSpacing/>
+            </w:pPr>
+            <w:r>
+              <w:t>1</w:t>
+            </w:r>
+          </w:p>
+        </w:tc>
+      </w:tr>
+    </w:tbl>
+    <w:p>
+      <w:pPr>
+        <w:contextualSpacing/>
+      </w:pPr>
+    </w:p>
+    <w:p>
+      <w:pPr>
+        <w:contextualSpacing/>
+        <w:jc w:val="center"/>
+      </w:pPr>
+    </w:p>
+    <w:p>
+      <w:pPr>
+        <w:contextualSpacing/>
+        <w:jc w:val="center"/>
+      </w:pPr>
+      <w:r>
+        <w:t>Директор                                                                  ____________ / Ф.И.О. /</w:t>
+      </w:r>
     </w:p>
     <w:sectPr>
       <w:headerReference w:type="default" r:id="rId8"/>
@@ -30,9 +329,6 @@
 <w:endnotes xmlns:wpc="http://schemas.microsoft.com/office/word/2010/wordprocessingCanvas" xmlns:cx="http://schemas.microsoft.com/office/drawing/2014/chartex" xmlns:cx1="http://schemas.microsoft.com/office/drawing/2015/9/8/chartex" xmlns:cx2="http://schemas.microsoft.com/office/drawing/2015/10/21/chartex" xmlns:cx3="http://schemas.microsoft.com/office/drawing/2016/5/9/chartex" xmlns:cx4="http://schemas.microsoft.com/office/drawing/2016/5/10/chartex" xmlns:cx5="http://schemas.microsoft.com/office/drawing/2016/5/11/chartex" xmlns:cx6="http://schemas.microsoft.com/office/drawing/2016/5/12/chartex" xmlns:cx7="http://schemas.microsoft.com/office/drawing/2016/5/13/chartex" xmlns:cx8="http://schemas.microsoft.com/office/drawing/2016/5/14/chartex" xmlns:mc="http://schemas.openxmlformats.org/markup-compatibility/2006" xmlns:aink="http://schemas.microsoft.com/office/drawing/2016/ink" xmlns:am3d="http://schemas.microsoft.com/office/drawing/2017/model3d" xmlns:o="urn:schemas-microsoft-com:office:office" xmlns:r="http://schemas.openxmlformats.org/officeDocument/2006/relationships" xmlns:m="http://schemas.openxmlformats.org/officeDocument/2006/math" xmlns:v="urn:schemas-microsoft-com:vml" xmlns:wp14="http://schemas.microsoft.com/office/word/2010/wordprocessingDrawing" xmlns:wp="http://schemas.openxmlformats.org/drawingml/2006/wordprocessingDrawing" xmlns:w10="urn:schemas-microsoft-com:office:word" xmlns:w="http://schemas.openxmlformats.org/wordprocessingml/2006/main" xmlns:w14="http://schemas.microsoft.com/office/word/2010/wordml" xmlns:w15="http://schemas.microsoft.com/office/word/2012/wordml" xmlns:w16cex="http://schemas.microsoft.com/office/word/2018/wordml/cex" xmlns:w16cid="http://schemas.microsoft.com/office/word/2016/wordml/cid" xmlns:w16="http://schemas.microsoft.com/office/word/2018/wordml" xmlns:w16sdtdh="http://schemas.microsoft.com/office/word/2020/wordml/sdtdatahash" xmlns:w16se="http://schemas.microsoft.com/office/word/2015/wordml/symex" xmlns:wpg="http://schemas.microsoft.com/office/word/2010/wordprocessingGroup" xmlns:wpi="http://schemas.microsoft.com/office/word/2010/wordprocessingInk" xmlns:wne="http://schemas.microsoft.com/office/word/2006/wordml" xmlns:wps="http://schemas.microsoft.com/office/word/2010/wordprocessingShape" mc:Ignorable="w14 w15 w16se w16cid w16 w16cex w16sdtdh wp14">
   <w:endnote w:type="separator" w:id="-1">
     <w:p>
-      <w:pPr>
-        <w:spacing w:after="0" w:line="240" w:lineRule="auto"/>
-      </w:pPr>
       <w:r>
         <w:separator/>
       </w:r>
@@ -40,9 +336,6 @@
   </w:endnote>
   <w:endnote w:type="continuationSeparator" w:id="0">
     <w:p>
-      <w:pPr>
-        <w:spacing w:after="0" w:line="240" w:lineRule="auto"/>
-      </w:pPr>
       <w:r>
         <w:continuationSeparator/>
       </w:r>
@@ -55,9 +348,6 @@
 <w:footnotes xmlns:wpc="http://schemas.microsoft.com/office/word/2010/wordprocessingCanvas" xmlns:cx="http://schemas.microsoft.com/office/drawing/2014/chartex" xmlns:cx1="http://schemas.microsoft.com/office/drawing/2015/9/8/chartex" xmlns:cx2="http://schemas.microsoft.com/office/drawing/2015/10/21/chartex" xmlns:cx3="http://schemas.microsoft.com/office/drawing/2016/5/9/chartex" xmlns:cx4="http://schemas.microsoft.com/office/drawing/2016/5/10/chartex" xmlns:cx5="http://schemas.microsoft.com/office/drawing/2016/5/11/chartex" xmlns:cx6="http://schemas.microsoft.com/office/drawing/2016/5/12/chartex" xmlns:cx7="http://schemas.microsoft.com/office/drawing/2016/5/13/chartex" xmlns:cx8="http://schemas.microsoft.com/office/drawing/2016/5/14/chartex" xmlns:mc="http://schemas.openxmlformats.org/markup-compatibility/2006" xmlns:aink="http://schemas.microsoft.com/office/drawing/2016/ink" xmlns:am3d="http://schemas.microsoft.com/office/drawing/2017/model3d" xmlns:o="urn:schemas-microsoft-com:office:office" xmlns:r="http://schemas.openxmlformats.org/officeDocument/2006/relationships" xmlns:m="http://schemas.openxmlformats.org/officeDocument/2006/math" xmlns:v="urn:schemas-microsoft-com:vml" xmlns:wp14="http://schemas.microsoft.com/office/word/2010/wordprocessingDrawing" xmlns:wp="http://schemas.openxmlformats.org/drawingml/2006/wordprocessingDrawing" xmlns:w10="urn:schemas-microsoft-com:office:word" xmlns:w="http://schemas.openxmlformats.org/wordprocessingml/2006/main" xmlns:w14="http://schemas.microsoft.com/office/word/2010/wordml" xmlns:w15="http://schemas.microsoft.com/office/word/2012/wordml" xmlns:w16cex="http://schemas.microsoft.com/office/word/2018/wordml/cex" xmlns:w16cid="http://schemas.microsoft.com/office/word/2016/wordml/cid" xmlns:w16="http://schemas.microsoft.com/office/word/2018/wordml" xmlns:w16sdtdh="http://schemas.microsoft.com/office/word/2020/wordml/sdtdatahash" xmlns:w16se="http://schemas.microsoft.com/office/word/2015/wordml/symex" xmlns:wpg="http://schemas.microsoft.com/office/word/2010/wordprocessingGroup" xmlns:wpi="http://schemas.microsoft.com/office/word/2010/wordprocessingInk" xmlns:wne="http://schemas.microsoft.com/office/word/2006/wordml" xmlns:wps="http://schemas.microsoft.com/office/word/2010/wordprocessingShape" mc:Ignorable="w14 w15 w16se w16cid w16 w16cex w16sdtdh wp14">
   <w:footnote w:type="separator" w:id="-1">
     <w:p>
-      <w:pPr>
-        <w:spacing w:after="0" w:line="240" w:lineRule="auto"/>
-      </w:pPr>
       <w:r>
         <w:separator/>
       </w:r>
@@ -65,9 +355,6 @@
   </w:footnote>
   <w:footnote w:type="continuationSeparator" w:id="0">
     <w:p>
-      <w:pPr>
-        <w:spacing w:after="0" w:line="240" w:lineRule="auto"/>
-      </w:pPr>
       <w:r>
         <w:continuationSeparator/>
       </w:r>
@@ -157,25 +444,7 @@
               <w:sz w:val="16"/>
               <w:szCs w:val="16"/>
             </w:rPr>
-            <w:t xml:space="preserve">пр. </w:t>
-          </w:r>
-          <w:proofErr w:type="spellStart"/>
-          <w:r>
-            <w:rPr>
-              <w:rFonts w:ascii="Arial" w:hAnsi="Arial" w:cs="Arial"/>
-              <w:sz w:val="16"/>
-              <w:szCs w:val="16"/>
-            </w:rPr>
-            <w:t>Кабанабай</w:t>
-          </w:r>
-          <w:proofErr w:type="spellEnd"/>
-          <w:r>
-            <w:rPr>
-              <w:rFonts w:ascii="Arial" w:hAnsi="Arial" w:cs="Arial"/>
-              <w:sz w:val="16"/>
-              <w:szCs w:val="16"/>
-            </w:rPr>
-            <w:t xml:space="preserve"> батыра, 17,</w:t>
+            <w:t>пр. Кабанабай батыра, 17,</w:t>
           </w:r>
         </w:p>
       </w:tc>
@@ -192,41 +461,13 @@
               <w:szCs w:val="16"/>
             </w:rPr>
           </w:pPr>
-          <w:proofErr w:type="spellStart"/>
           <w:r>
             <w:rPr>
               <w:rFonts w:ascii="Arial" w:hAnsi="Arial" w:cs="Arial"/>
               <w:sz w:val="16"/>
               <w:szCs w:val="16"/>
             </w:rPr>
-            <w:t>Қазақстан</w:t>
-          </w:r>
-          <w:proofErr w:type="spellEnd"/>
-          <w:r>
-            <w:rPr>
-              <w:rFonts w:ascii="Arial" w:hAnsi="Arial" w:cs="Arial"/>
-              <w:sz w:val="16"/>
-              <w:szCs w:val="16"/>
-            </w:rPr>
-            <w:t xml:space="preserve"> </w:t>
-          </w:r>
-          <w:proofErr w:type="spellStart"/>
-          <w:r>
-            <w:rPr>
-              <w:rFonts w:ascii="Arial" w:hAnsi="Arial" w:cs="Arial"/>
-              <w:sz w:val="16"/>
-              <w:szCs w:val="16"/>
-            </w:rPr>
-            <w:t>Республикасы</w:t>
-          </w:r>
-          <w:proofErr w:type="spellEnd"/>
-          <w:r>
-            <w:rPr>
-              <w:rFonts w:ascii="Arial" w:hAnsi="Arial" w:cs="Arial"/>
-              <w:sz w:val="16"/>
-              <w:szCs w:val="16"/>
-            </w:rPr>
-            <w:t>,</w:t>
+            <w:t>Қазақстан Республикасы,</w:t>
           </w:r>
         </w:p>
         <w:p>
@@ -256,41 +497,13 @@
               <w:szCs w:val="16"/>
             </w:rPr>
           </w:pPr>
-          <w:proofErr w:type="spellStart"/>
           <w:r>
             <w:rPr>
               <w:rFonts w:ascii="Arial" w:hAnsi="Arial" w:cs="Arial"/>
               <w:sz w:val="16"/>
               <w:szCs w:val="16"/>
             </w:rPr>
-            <w:t>Қабанбай</w:t>
-          </w:r>
-          <w:proofErr w:type="spellEnd"/>
-          <w:r>
-            <w:rPr>
-              <w:rFonts w:ascii="Arial" w:hAnsi="Arial" w:cs="Arial"/>
-              <w:sz w:val="16"/>
-              <w:szCs w:val="16"/>
-            </w:rPr>
-            <w:t xml:space="preserve"> батыр д-</w:t>
-          </w:r>
-          <w:proofErr w:type="spellStart"/>
-          <w:r>
-            <w:rPr>
-              <w:rFonts w:ascii="Arial" w:hAnsi="Arial" w:cs="Arial"/>
-              <w:sz w:val="16"/>
-              <w:szCs w:val="16"/>
-            </w:rPr>
-            <w:t>лы</w:t>
-          </w:r>
-          <w:proofErr w:type="spellEnd"/>
-          <w:r>
-            <w:rPr>
-              <w:rFonts w:ascii="Arial" w:hAnsi="Arial" w:cs="Arial"/>
-              <w:sz w:val="16"/>
-              <w:szCs w:val="16"/>
-            </w:rPr>
-            <w:t xml:space="preserve">, 17 </w:t>
+            <w:t xml:space="preserve">Қабанбай батыр д-лы, 17 </w:t>
           </w:r>
         </w:p>
       </w:tc>
@@ -308,7 +521,6 @@
               <w:lang w:val="en-US"/>
             </w:rPr>
           </w:pPr>
-          <w:proofErr w:type="spellStart"/>
           <w:r>
             <w:rPr>
               <w:rFonts w:ascii="Arial" w:hAnsi="Arial" w:cs="Arial"/>
@@ -316,19 +528,8 @@
               <w:szCs w:val="16"/>
               <w:lang w:val="en-US"/>
             </w:rPr>
-            <w:t>Kabanbay</w:t>
+            <w:t xml:space="preserve">Kabanbay </w:t>
           </w:r>
-          <w:proofErr w:type="spellEnd"/>
-          <w:r>
-            <w:rPr>
-              <w:rFonts w:ascii="Arial" w:hAnsi="Arial" w:cs="Arial"/>
-              <w:sz w:val="16"/>
-              <w:szCs w:val="16"/>
-              <w:lang w:val="en-US"/>
-            </w:rPr>
-            <w:t xml:space="preserve"> </w:t>
-          </w:r>
-          <w:proofErr w:type="spellStart"/>
           <w:r>
             <w:rPr>
               <w:rFonts w:ascii="Arial" w:hAnsi="Arial" w:cs="Arial"/>
@@ -345,19 +546,8 @@
               <w:szCs w:val="16"/>
               <w:lang w:val="en-US"/>
             </w:rPr>
-            <w:t>atyr</w:t>
+            <w:t xml:space="preserve">atyr </w:t>
           </w:r>
-          <w:proofErr w:type="spellEnd"/>
-          <w:r>
-            <w:rPr>
-              <w:rFonts w:ascii="Arial" w:hAnsi="Arial" w:cs="Arial"/>
-              <w:sz w:val="16"/>
-              <w:szCs w:val="16"/>
-              <w:lang w:val="en-US"/>
-            </w:rPr>
-            <w:t xml:space="preserve"> </w:t>
-          </w:r>
-          <w:proofErr w:type="spellStart"/>
           <w:r>
             <w:rPr>
               <w:rFonts w:ascii="Arial" w:hAnsi="Arial" w:cs="Arial"/>
@@ -374,17 +564,7 @@
               <w:szCs w:val="16"/>
               <w:lang w:val="en-US"/>
             </w:rPr>
-            <w:t>.</w:t>
-          </w:r>
-          <w:proofErr w:type="spellEnd"/>
-          <w:r>
-            <w:rPr>
-              <w:rFonts w:ascii="Arial" w:hAnsi="Arial" w:cs="Arial"/>
-              <w:sz w:val="16"/>
-              <w:szCs w:val="16"/>
-              <w:lang w:val="en-US"/>
-            </w:rPr>
-            <w:t>,</w:t>
+            <w:t>.,</w:t>
           </w:r>
           <w:r>
             <w:rPr>
@@ -688,7 +868,7 @@
         <w:noProof/>
       </w:rPr>
       <w:drawing>
-        <wp:anchor distT="0" distB="0" distL="114300" distR="114300" simplePos="0" relativeHeight="251660288" behindDoc="1" locked="0" layoutInCell="1" allowOverlap="1" wp14:anchorId="440B8F5C" wp14:editId="7FE34479">
+        <wp:anchor distT="0" distB="0" distL="114300" distR="114300" simplePos="0" relativeHeight="251660288" behindDoc="1" locked="0" layoutInCell="1" allowOverlap="1" wp14:anchorId="59F9D312" wp14:editId="60234E33">
           <wp:simplePos x="0" y="0"/>
           <wp:positionH relativeFrom="page">
             <wp:posOffset>-735678</wp:posOffset>
@@ -756,7 +936,7 @@
         <w:noProof/>
       </w:rPr>
       <w:drawing>
-        <wp:anchor distT="0" distB="0" distL="114300" distR="114300" simplePos="0" relativeHeight="251658240" behindDoc="1" locked="0" layoutInCell="1" allowOverlap="1" wp14:anchorId="650E05D8" wp14:editId="079B947C">
+        <wp:anchor distT="0" distB="0" distL="114300" distR="114300" simplePos="0" relativeHeight="251658240" behindDoc="1" locked="0" layoutInCell="1" allowOverlap="1" wp14:anchorId="457BF39D" wp14:editId="3F3D95E4">
           <wp:simplePos x="0" y="0"/>
           <wp:positionH relativeFrom="margin">
             <wp:posOffset>-767207</wp:posOffset>
@@ -2246,6 +2426,13 @@
   <w:style w:type="paragraph" w:default="1" w:styleId="a">
     <w:name w:val="Normal"/>
     <w:qFormat/>
+    <w:pPr>
+      <w:spacing w:after="0" w:line="240" w:lineRule="auto"/>
+    </w:pPr>
+    <w:rPr>
+      <w:rFonts w:ascii="Times New Roman" w:eastAsia="Times New Roman" w:hAnsi="Times New Roman" w:cs="Times New Roman"/>
+      <w:sz w:val="24"/>
+    </w:rPr>
   </w:style>
   <w:style w:type="paragraph" w:styleId="3">
     <w:name w:val="heading 3"/>
@@ -2255,11 +2442,10 @@
     <w:qFormat/>
     <w:rsid w:val="00F40821"/>
     <w:pPr>
-      <w:spacing w:before="100" w:beforeAutospacing="1" w:after="100" w:afterAutospacing="1" w:line="240" w:lineRule="auto"/>
+      <w:spacing w:before="100" w:beforeAutospacing="1" w:after="100" w:afterAutospacing="1"/>
       <w:outlineLvl w:val="2"/>
     </w:pPr>
     <w:rPr>
-      <w:rFonts w:ascii="Times New Roman" w:eastAsia="Times New Roman" w:hAnsi="Times New Roman" w:cs="Times New Roman"/>
       <w:b/>
       <w:bCs/>
       <w:kern w:val="0"/>
@@ -2344,7 +2530,6 @@
         <w:tab w:val="center" w:pos="4677"/>
         <w:tab w:val="right" w:pos="9355"/>
       </w:tabs>
-      <w:spacing w:after="0" w:line="240" w:lineRule="auto"/>
     </w:pPr>
   </w:style>
   <w:style w:type="character" w:customStyle="1" w:styleId="a5">
@@ -2366,7 +2551,6 @@
         <w:tab w:val="center" w:pos="4677"/>
         <w:tab w:val="right" w:pos="9355"/>
       </w:tabs>
-      <w:spacing w:after="0" w:line="240" w:lineRule="auto"/>
     </w:pPr>
   </w:style>
   <w:style w:type="character" w:customStyle="1" w:styleId="a7">
@@ -2452,12 +2636,10 @@
     <w:unhideWhenUsed/>
     <w:rsid w:val="00F40821"/>
     <w:pPr>
-      <w:spacing w:before="100" w:beforeAutospacing="1" w:after="100" w:afterAutospacing="1" w:line="240" w:lineRule="auto"/>
+      <w:spacing w:before="100" w:beforeAutospacing="1" w:after="100" w:afterAutospacing="1"/>
     </w:pPr>
     <w:rPr>
-      <w:rFonts w:ascii="Times New Roman" w:eastAsia="Times New Roman" w:hAnsi="Times New Roman" w:cs="Times New Roman"/>
       <w:kern w:val="0"/>
-      <w:sz w:val="24"/>
       <w:szCs w:val="24"/>
       <w:lang w:eastAsia="ru-RU"/>
       <w14:ligatures w14:val="none"/>
@@ -2485,12 +2667,10 @@
     <w:basedOn w:val="a"/>
     <w:rsid w:val="009359EE"/>
     <w:pPr>
-      <w:spacing w:before="100" w:beforeAutospacing="1" w:after="100" w:afterAutospacing="1" w:line="240" w:lineRule="auto"/>
+      <w:spacing w:before="100" w:beforeAutospacing="1" w:after="100" w:afterAutospacing="1"/>
     </w:pPr>
     <w:rPr>
-      <w:rFonts w:ascii="Times New Roman" w:eastAsia="Times New Roman" w:hAnsi="Times New Roman" w:cs="Times New Roman"/>
       <w:kern w:val="0"/>
-      <w:sz w:val="24"/>
       <w:szCs w:val="24"/>
       <w:lang w:eastAsia="ru-RU"/>
       <w14:ligatures w14:val="none"/>

</xml_diff>